<commit_message>
Full rerun check of camera-ready numbers; fix two stale values; correct label-balance notes
Rerun from scratch (fa377a0 tables, ablation, feature importance, cross-platform,
leave-one-machine-out, leave-one-repetition-out) matches the stored outputs.
Checked 120 numbers in the camera-ready docx against the rerun CSVs and fixed
two: section 3.4 lineage count 5,072 -> 4,965 and Table 5 Linux->Windows
all-positive F1 0.637 -> 0.638. CLAUDE.md: the 0.5-point label balance between
platforms came from the Windows parser bug; the corrected gap is 17.7 points.

Co-Authored-By: Claude Opus 5.5 <noreply@anthropic.com>
</commit_message>
<xml_diff>
--- a/docs/paper21_camera_ready.docx
+++ b/docs/paper21_camera_ready.docx
@@ -3990,7 +3990,7 @@
           <w:lang w:bidi="th-TH" w:val="th-TH"/>
           <w:cs/>
         </w:rPr>
-        <w:t xml:space="preserve">รวมเหตุการณ์ที่มีระบบปฏิบัติการ รหัสรอบทดลอง (run_id) และ ProcessGuid เดียวกันเป็นหนึ่งตัวอย่าง ตัดเหตุการณ์ที่ไม่มี ProcessGuid หรือมีรหัสค่าศูนย์ออก ได้ 23,971 ตัวอย่าง หากกลุ่มใดมีเหตุการณ์ label=1 อย่างน้อยหนึ่งรายการ ให้ตัวอย่างนั้นเป็น label=1 การใช้รหัสทั้งสามร่วมกันช่วยแยกโปรเซสต่างรอบที่มี ProcessGuid ซ้ำกัน โดยพบรหัสค่าศูนย์ 612 Event จาก 8 รอบ และรหัสซ้ำระหว่างสถานการณ์ exploit กับ miner บน Linux 12 Event จากนั้นเชื่อมโปรเซสแม่กับลูกด้วย ParentProcessGuid ภายในรอบเดียวกัน ได้สายโปรเซส 5,072 กลุ่มสำหรับแบ่งชุดฝึกและชุดทดสอบ</w:t>
+        <w:t>รวมเหตุการณ์ที่มีระบบปฏิบัติการ รหัสรอบทดลอง (run_id) และ ProcessGuid เดียวกันเป็นหนึ่งตัวอย่าง ตัดเหตุการณ์ที่ไม่มี ProcessGuid หรือมีรหัสค่าศูนย์ออก ได้ 23,971 ตัวอย่าง หากกลุ่มใดมีเหตุการณ์ label=1 อย่างน้อยหนึ่งรายการ ให้ตัวอย่างนั้นเป็น label=1 การใช้รหัสทั้งสามร่วมกันช่วยแยกโปรเซสต่างรอบที่มี ProcessGuid ซ้ำกัน โดยพบรหัสค่าศูนย์ 612 Event จาก 8 รอบ และรหัสซ้ำระหว่างสถานการณ์ exploit กับ miner บน Linux 12 Event จากนั้นเชื่อมโปรเซสแม่กับลูกด้วย ParentProcessGuid ภายในรอบเดียวกัน ได้สายโปรเซส 4,965 กลุ่มสำหรับแบ่งชุดฝึกและชุดทดสอบ</w:t>
       </w:r>
     </w:p>
     <w:p>
@@ -9945,7 +9945,7 @@
                 <w:sz w:val="22"/>
                 <w:lang w:bidi="th-TH"/>
               </w:rPr>
-              <w:t>0.637</w:t>
+              <w:t>0.638</w:t>
             </w:r>
           </w:p>
         </w:tc>

</xml_diff>